<commit_message>
feat: update academic grades configuration and refresh resume document
</commit_message>
<xml_diff>
--- a/public/resume.docx
+++ b/public/resume.docx
@@ -797,7 +797,6 @@
         <w:ind w:left="840" w:leftChars="0" w:hanging="420" w:firstLineChars="0"/>
         <w:jc w:val="both"/>
       </w:pPr>
-      <w:bookmarkStart w:id="0" w:name="_GoBack"/>
       <w:r>
         <w:rPr>
           <w:rFonts w:ascii="Arial" w:hAnsi="Arial" w:eastAsia="Arial" w:cs="Arial"/>
@@ -825,16 +824,7 @@
           <w:sz w:val="20"/>
           <w:szCs w:val="20"/>
         </w:rPr>
-        <w:t xml:space="preserve">Church management web app for scheduling, announcements, and </w:t>
-      </w:r>
-      <w:bookmarkEnd w:id="0"/>
-      <w:r>
-        <w:rPr>
-          <w:rFonts w:ascii="Arial" w:hAnsi="Arial" w:eastAsia="Arial" w:cs="Arial"/>
-          <w:sz w:val="20"/>
-          <w:szCs w:val="20"/>
-        </w:rPr>
-        <w:t>congregation coordination.</w:t>
+        <w:t>Church management web app for scheduling, announcements, and congregation coordination.</w:t>
       </w:r>
     </w:p>
     <w:p>
@@ -1159,6 +1149,8 @@
         </w:rPr>
         <w:t>Cisco · May 2026</w:t>
       </w:r>
+      <w:bookmarkStart w:id="0" w:name="_GoBack"/>
+      <w:bookmarkEnd w:id="0"/>
     </w:p>
     <w:p>
       <w:pPr>
@@ -1298,6 +1290,34 @@
           <w:szCs w:val="20"/>
         </w:rPr>
         <w:t>Google · May 2024</w:t>
+      </w:r>
+    </w:p>
+    <w:p>
+      <w:pPr>
+        <w:numPr>
+          <w:ilvl w:val="0"/>
+          <w:numId w:val="1"/>
+        </w:numPr>
+        <w:spacing w:before="30" w:after="18"/>
+        <w:ind w:left="840" w:leftChars="0" w:hanging="420" w:firstLineChars="0"/>
+      </w:pPr>
+      <w:r>
+        <w:rPr>
+          <w:rFonts w:hint="default" w:ascii="Times New Roman Bold" w:hAnsi="Times New Roman Bold" w:cs="Times New Roman Bold"/>
+          <w:b/>
+          <w:bCs/>
+          <w:lang w:val="en-US"/>
+        </w:rPr>
+        <w:t xml:space="preserve">GCI World 2026 </w:t>
+      </w:r>
+      <w:r>
+        <w:rPr>
+          <w:rFonts w:hint="default" w:cs="Times New Roman"/>
+          <w:b w:val="0"/>
+          <w:bCs w:val="0"/>
+          <w:lang w:val="en-US"/>
+        </w:rPr>
+        <w:t xml:space="preserve">Tokyo University - Data Science and Machine Learning </w:t>
       </w:r>
     </w:p>
     <w:p>
@@ -1790,6 +1810,7 @@
     <w:qFormat/>
     <w:uiPriority w:val="0"/>
     <w:rPr>
+      <w:rFonts w:ascii="Times New Roman" w:hAnsi="Times New Roman" w:eastAsia="SimSun" w:cs="Times New Roman"/>
       <w:sz w:val="21"/>
       <w:szCs w:val="22"/>
     </w:rPr>
@@ -1800,6 +1821,7 @@
     <w:qFormat/>
     <w:uiPriority w:val="0"/>
     <w:rPr>
+      <w:rFonts w:ascii="Times New Roman" w:hAnsi="Times New Roman" w:eastAsia="SimSun" w:cs="Times New Roman"/>
       <w:color w:val="2E74B5"/>
       <w:sz w:val="32"/>
       <w:szCs w:val="32"/>
@@ -1811,6 +1833,7 @@
     <w:qFormat/>
     <w:uiPriority w:val="0"/>
     <w:rPr>
+      <w:rFonts w:ascii="Times New Roman" w:hAnsi="Times New Roman" w:eastAsia="SimSun" w:cs="Times New Roman"/>
       <w:color w:val="2E74B5"/>
       <w:sz w:val="26"/>
       <w:szCs w:val="26"/>
@@ -1822,6 +1845,7 @@
     <w:qFormat/>
     <w:uiPriority w:val="0"/>
     <w:rPr>
+      <w:rFonts w:ascii="Times New Roman" w:hAnsi="Times New Roman" w:eastAsia="SimSun" w:cs="Times New Roman"/>
       <w:color w:val="1F4D78"/>
       <w:sz w:val="24"/>
       <w:szCs w:val="24"/>
@@ -1833,6 +1857,7 @@
     <w:qFormat/>
     <w:uiPriority w:val="0"/>
     <w:rPr>
+      <w:rFonts w:ascii="Times New Roman" w:hAnsi="Times New Roman" w:eastAsia="SimSun" w:cs="Times New Roman"/>
       <w:i/>
       <w:iCs/>
       <w:color w:val="2E74B5"/>
@@ -1846,6 +1871,7 @@
     <w:qFormat/>
     <w:uiPriority w:val="0"/>
     <w:rPr>
+      <w:rFonts w:ascii="Times New Roman" w:hAnsi="Times New Roman" w:eastAsia="SimSun" w:cs="Times New Roman"/>
       <w:color w:val="2E74B5"/>
       <w:sz w:val="21"/>
       <w:szCs w:val="22"/>
@@ -1857,6 +1883,7 @@
     <w:qFormat/>
     <w:uiPriority w:val="0"/>
     <w:rPr>
+      <w:rFonts w:ascii="Times New Roman" w:hAnsi="Times New Roman" w:eastAsia="SimSun" w:cs="Times New Roman"/>
       <w:color w:val="1F4D78"/>
       <w:sz w:val="21"/>
       <w:szCs w:val="22"/>
@@ -1899,6 +1926,7 @@
       <w:spacing w:after="0" w:line="240" w:lineRule="auto"/>
     </w:pPr>
     <w:rPr>
+      <w:rFonts w:ascii="Times New Roman" w:hAnsi="Times New Roman" w:eastAsia="SimSun" w:cs="Times New Roman"/>
       <w:sz w:val="20"/>
       <w:szCs w:val="20"/>
     </w:rPr>
@@ -1931,6 +1959,7 @@
       <w:spacing w:after="0" w:line="240" w:lineRule="auto"/>
     </w:pPr>
     <w:rPr>
+      <w:rFonts w:ascii="Times New Roman" w:hAnsi="Times New Roman" w:eastAsia="SimSun" w:cs="Times New Roman"/>
       <w:sz w:val="20"/>
       <w:szCs w:val="20"/>
     </w:rPr>
@@ -1949,6 +1978,7 @@
     <w:qFormat/>
     <w:uiPriority w:val="0"/>
     <w:rPr>
+      <w:rFonts w:ascii="Times New Roman" w:hAnsi="Times New Roman" w:eastAsia="SimSun" w:cs="Times New Roman"/>
       <w:sz w:val="56"/>
       <w:szCs w:val="56"/>
     </w:rPr>
@@ -1958,6 +1988,7 @@
     <w:qFormat/>
     <w:uiPriority w:val="0"/>
     <w:rPr>
+      <w:rFonts w:ascii="Times New Roman" w:hAnsi="Times New Roman" w:eastAsia="SimSun" w:cs="Times New Roman"/>
       <w:sz w:val="21"/>
       <w:szCs w:val="22"/>
     </w:rPr>

</xml_diff>